<commit_message>
📝 docs(day22): revise setouchi itinerary document content
</commit_message>
<xml_diff>
--- a/iThome-2026-Ironman/Day22_20260905/廣島進・高松出（瀨戶內海）五日行程攻略_公開版.docx
+++ b/iThome-2026-Ironman/Day22_20260905/廣島進・高松出（瀨戶內海）五日行程攻略_公開版.docx
@@ -5496,77 +5496,6 @@
         </w:rPr>
         <w:lastRenderedPageBreak/>
         <w:t>集合與聯絡資訊（依旅行社最終手冊）</w:t>
-      </w:r>
-    </w:p>
-    <w:p>
-      <w:pPr>
-        <w:pStyle w:val="a4"/>
-        <w:numPr>
-          <w:ilvl w:val="0"/>
-          <w:numId w:val="41"/>
-        </w:numPr>
-        <w:spacing w:after="60" w:line="300" w:lineRule="auto"/>
-        <w:ind w:leftChars="0"/>
-        <w:jc w:val="left"/>
-      </w:pPr>
-      <w:r>
-        <w:rPr>
-          <w:b/>
-          <w:bCs/>
-          <w:color w:val="000000"/>
-        </w:rPr>
-        <w:t>遊覽車集合</w:t>
-      </w:r>
-      <w:r>
-        <w:rPr>
-          <w:b/>
-          <w:bCs/>
-          <w:color w:val="000000"/>
-        </w:rPr>
-        <w:br/>
-      </w:r>
-      <w:r>
-        <w:rPr>
-          <w:color w:val="000000"/>
-        </w:rPr>
-        <w:t xml:space="preserve">9/24 </w:t>
-      </w:r>
-      <w:r>
-        <w:rPr>
-          <w:color w:val="000000"/>
-        </w:rPr>
-        <w:t>早上</w:t>
-      </w:r>
-      <w:r>
-        <w:rPr>
-          <w:color w:val="000000"/>
-        </w:rPr>
-        <w:t xml:space="preserve"> 03:30</w:t>
-      </w:r>
-      <w:r>
-        <w:rPr>
-          <w:color w:val="000000"/>
-        </w:rPr>
-        <w:t>，</w:t>
-      </w:r>
-      <w:proofErr w:type="gramStart"/>
-      <w:r>
-        <w:rPr>
-          <w:color w:val="000000"/>
-        </w:rPr>
-        <w:t>公司</w:t>
-      </w:r>
-      <w:proofErr w:type="gramEnd"/>
-      <w:r>
-        <w:rPr>
-          <w:color w:val="000000"/>
-        </w:rPr>
-      </w:r>
-      <w:r>
-        <w:rPr>
-          <w:color w:val="000000"/>
-        </w:rPr>
-        <w:t>集合地點。</w:t>
       </w:r>
     </w:p>
     <w:p>

</xml_diff>